<commit_message>
Correct presentation to two-view readiness (strict ~0% + graded 42/12/46); regenerate docx/pptx/chart; fix build scripts
</commit_message>
<xml_diff>
--- a/presentation/final_report.docx
+++ b/presentation/final_report.docx
@@ -3634,7 +3634,7 @@
               <w:rPr>
                 <w:sz w:val="20"/>
               </w:rPr>
-              <w:t>475 / 750 (63.3%)</w:t>
+              <w:t>~0 / 750 (~0%)</w:t>
             </w:r>
           </w:p>
         </w:tc>
@@ -3699,6 +3699,96 @@
           </w:p>
         </w:tc>
       </w:tr>
+      <w:tr>
+        <w:tc>
+          <w:tcPr>
+            <w:tcW w:type="dxa" w:w="5040"/>
+          </w:tcPr>
+          <w:p>
+            <w:r/>
+            <w:r>
+              <w:rPr>
+                <w:sz w:val="20"/>
+              </w:rPr>
+              <w:t>Graded completeness - Ready (score &gt;= 80)</w:t>
+            </w:r>
+          </w:p>
+        </w:tc>
+        <w:tc>
+          <w:tcPr>
+            <w:tcW w:type="dxa" w:w="5040"/>
+          </w:tcPr>
+          <w:p>
+            <w:r/>
+            <w:r>
+              <w:rPr>
+                <w:sz w:val="20"/>
+              </w:rPr>
+              <w:t>315 / 750 (42.0%)</w:t>
+            </w:r>
+          </w:p>
+        </w:tc>
+      </w:tr>
+      <w:tr>
+        <w:tc>
+          <w:tcPr>
+            <w:tcW w:type="dxa" w:w="5040"/>
+          </w:tcPr>
+          <w:p>
+            <w:r/>
+            <w:r>
+              <w:rPr>
+                <w:sz w:val="20"/>
+              </w:rPr>
+              <w:t>Graded completeness - Needs review (60-79)</w:t>
+            </w:r>
+          </w:p>
+        </w:tc>
+        <w:tc>
+          <w:tcPr>
+            <w:tcW w:type="dxa" w:w="5040"/>
+          </w:tcPr>
+          <w:p>
+            <w:r/>
+            <w:r>
+              <w:rPr>
+                <w:sz w:val="20"/>
+              </w:rPr>
+              <w:t>93 / 750 (12.4%)</w:t>
+            </w:r>
+          </w:p>
+        </w:tc>
+      </w:tr>
+      <w:tr>
+        <w:tc>
+          <w:tcPr>
+            <w:tcW w:type="dxa" w:w="5040"/>
+          </w:tcPr>
+          <w:p>
+            <w:r/>
+            <w:r>
+              <w:rPr>
+                <w:sz w:val="20"/>
+              </w:rPr>
+              <w:t>Graded completeness - Not ready (&lt; 60)</w:t>
+            </w:r>
+          </w:p>
+        </w:tc>
+        <w:tc>
+          <w:tcPr>
+            <w:tcW w:type="dxa" w:w="5040"/>
+          </w:tcPr>
+          <w:p>
+            <w:r/>
+            <w:r>
+              <w:rPr>
+                <w:sz w:val="20"/>
+              </w:rPr>
+              <w:t>342 / 750 (45.6%)</w:t>
+            </w:r>
+          </w:p>
+        </w:tc>
+      </w:tr>
     </w:tbl>
     <w:p/>
     <w:p>
@@ -3708,7 +3798,7 @@
       <w:r>
         <w:drawing>
           <wp:inline xmlns:a="http://schemas.openxmlformats.org/drawingml/2006/main" xmlns:pic="http://schemas.openxmlformats.org/drawingml/2006/picture">
-            <wp:extent cx="5303520" cy="3354254"/>
+            <wp:extent cx="5303520" cy="2157900"/>
             <wp:docPr id="8" name="Picture 8"/>
             <wp:cNvGraphicFramePr>
               <a:graphicFrameLocks noChangeAspect="1"/>
@@ -3729,7 +3819,7 @@
                   <pic:spPr>
                     <a:xfrm>
                       <a:off x="0" y="0"/>
-                      <a:ext cx="5303520" cy="3354254"/>
+                      <a:ext cx="5303520" cy="2157900"/>
                     </a:xfrm>
                     <a:prstGeom prst="rect"/>
                   </pic:spPr>
@@ -3750,7 +3840,7 @@
           <w:color w:val="555555"/>
           <w:sz w:val="19"/>
         </w:rPr>
-        <w:t>Figure 6. Obligation-readiness across the 750-invoice batch under three preset verdict policies. Strict = 0% because Strict requires a visual mark and this invoice corpus contains none - a fail-closed, correct verdict given the corpus.</w:t>
+        <w:t>Figure 6. Obligation-readiness across the 750-invoice batch. Strict fail-closed policies: Lenient 100%, Default ~0% (requires a PO/contract reference the corpus lacks), Strict 0% (also requires a visual mark it lacks) - an honest domain gap, not an engine defect. An earlier Default 63.3% was a loose-matching artifact, since corrected. The graded completeness score gives the meaningful spread: Ready 42.0%, Needs review 12.4%, Not ready 45.6% (mean 76.3).</w:t>
       </w:r>
     </w:p>
     <w:p/>

</xml_diff>